<commit_message>
fix: encode picture-field values, clear alt text, cleaner errors
Co-Authored-By: Claude Opus 5.5 <noreply@anthropic.com>
</commit_message>
<xml_diff>
--- a/nexus/test/fixtures/pictures.docx
+++ b/nexus/test/fixtures/pictures.docx
@@ -12,7 +12,7 @@
               <a:graphicData uri="http://schemas.openxmlformats.org/drawingml/2006/picture">
                 <pic:pic>
                   <pic:nvPicPr>
-                    <pic:cNvPr id="1" name="Picture 1"/>
+                    <pic:cNvPr id="1" name="Picture 1" descr="{d.photo:image}"/>
                     <pic:cNvPicPr/>
                   </pic:nvPicPr>
                   <pic:blipFill>
@@ -47,7 +47,7 @@
               <a:graphicData uri="http://schemas.openxmlformats.org/drawingml/2006/picture">
                 <pic:pic>
                   <pic:nvPicPr>
-                    <pic:cNvPr id="2" name="Picture 2"/>
+                    <pic:cNvPr id="2" name="Picture 2" descr="{d.link:qrcode}"/>
                     <pic:cNvPicPr/>
                   </pic:nvPicPr>
                   <pic:blipFill>
@@ -82,7 +82,7 @@
               <a:graphicData uri="http://schemas.openxmlformats.org/drawingml/2006/picture">
                 <pic:pic>
                   <pic:nvPicPr>
-                    <pic:cNvPr id="3" name="Picture 3"/>
+                    <pic:cNvPr id="3" name="Picture 3" descr="{d.code:barcode(code128)}"/>
                     <pic:cNvPicPr/>
                   </pic:nvPicPr>
                   <pic:blipFill>
@@ -117,7 +117,42 @@
               <a:graphicData uri="http://schemas.openxmlformats.org/drawingml/2006/picture">
                 <pic:pic>
                   <pic:nvPicPr>
-                    <pic:cNvPr id="4" name="Picture 4"/>
+                    <pic:cNvPr id="4" name="Picture 4" descr="{d.hex:swatch}"/>
+                    <pic:cNvPicPr/>
+                  </pic:nvPicPr>
+                  <pic:blipFill>
+                    <a:blip r:embed="rIdPh"/>
+                    <a:stretch>
+                      <a:fillRect/>
+                    </a:stretch>
+                  </pic:blipFill>
+                  <pic:spPr>
+                    <a:xfrm>
+                      <a:off x="0" y="0"/>
+                      <a:ext cx="914400" cy="914400"/>
+                    </a:xfrm>
+                    <a:prstGeom prst="rect">
+                      <a:avLst/>
+                    </a:prstGeom>
+                  </pic:spPr>
+                </pic:pic>
+              </a:graphicData>
+            </a:graphic>
+          </wp:inline>
+        </w:drawing>
+      </w:r>
+    </w:p>
+    <w:p>
+      <w:r>
+        <w:drawing>
+          <wp:inline distT="0" distB="0" distL="0" distR="0">
+            <wp:extent cx="914400" cy="914400"/>
+            <wp:docPr id="6" name="Picture 6" descr="{d.ean:barcode(ean13)}"/>
+            <a:graphic>
+              <a:graphicData uri="http://schemas.openxmlformats.org/drawingml/2006/picture">
+                <pic:pic>
+                  <pic:nvPicPr>
+                    <pic:cNvPr id="6" name="Picture 6" descr="{d.ean:barcode(ean13)}"/>
                     <pic:cNvPicPr/>
                   </pic:nvPicPr>
                   <pic:blipFill>
@@ -152,7 +187,7 @@
               <a:graphicData uri="http://schemas.openxmlformats.org/drawingml/2006/picture">
                 <pic:pic>
                   <pic:nvPicPr>
-                    <pic:cNvPr id="5" name="Picture 5"/>
+                    <pic:cNvPr id="5" name="Picture 5" descr="{d.colours[i].hex:swatch}"/>
                     <pic:cNvPicPr/>
                   </pic:nvPicPr>
                   <pic:blipFill>

</xml_diff>